<commit_message>
a few more minor tweaks to induction lab
</commit_message>
<xml_diff>
--- a/StudentGuideModule2/induction_sinusoidal/big_coil_pic_2026.docx
+++ b/StudentGuideModule2/induction_sinusoidal/big_coil_pic_2026.docx
@@ -67,8 +67,8 @@
                             <w:pPr>
                               <w:rPr>
                                 <w:color w:val="973971"/>
-                                <w:sz w:val="24"/>
-                                <w:szCs w:val="24"/>
+                                <w:sz w:val="36"/>
+                                <w:szCs w:val="36"/>
                               </w:rPr>
                             </w:pPr>
                             <m:oMathPara>
@@ -81,8 +81,8 @@
                                         <w:rFonts w:ascii="Cambria Math" w:hAnsi="Cambria Math"/>
                                         <w:i/>
                                         <w:color w:val="973971"/>
-                                        <w:sz w:val="24"/>
-                                        <w:szCs w:val="24"/>
+                                        <w:sz w:val="36"/>
+                                        <w:szCs w:val="36"/>
                                       </w:rPr>
                                     </m:ctrlPr>
                                   </m:accPr>
@@ -91,8 +91,8 @@
                                       <w:rPr>
                                         <w:rFonts w:ascii="Cambria Math" w:hAnsi="Cambria Math"/>
                                         <w:color w:val="973971"/>
-                                        <w:sz w:val="24"/>
-                                        <w:szCs w:val="24"/>
+                                        <w:sz w:val="36"/>
+                                        <w:szCs w:val="36"/>
                                       </w:rPr>
                                       <m:t>I</m:t>
                                     </m:r>
@@ -134,8 +134,8 @@
                       <w:pPr>
                         <w:rPr>
                           <w:color w:val="973971"/>
-                          <w:sz w:val="24"/>
-                          <w:szCs w:val="24"/>
+                          <w:sz w:val="36"/>
+                          <w:szCs w:val="36"/>
                         </w:rPr>
                       </w:pPr>
                       <m:oMathPara>
@@ -148,8 +148,8 @@
                                   <w:rFonts w:ascii="Cambria Math" w:hAnsi="Cambria Math"/>
                                   <w:i/>
                                   <w:color w:val="973971"/>
-                                  <w:sz w:val="24"/>
-                                  <w:szCs w:val="24"/>
+                                  <w:sz w:val="36"/>
+                                  <w:szCs w:val="36"/>
                                 </w:rPr>
                               </m:ctrlPr>
                             </m:accPr>
@@ -158,8 +158,8 @@
                                 <w:rPr>
                                   <w:rFonts w:ascii="Cambria Math" w:hAnsi="Cambria Math"/>
                                   <w:color w:val="973971"/>
-                                  <w:sz w:val="24"/>
-                                  <w:szCs w:val="24"/>
+                                  <w:sz w:val="36"/>
+                                  <w:szCs w:val="36"/>
                                 </w:rPr>
                                 <m:t>I</m:t>
                               </m:r>

</xml_diff>